<commit_message>
Simplify lab to required two variants for satisfactory grade
</commit_message>
<xml_diff>
--- a/preparation/Подготовка_к_защите.docx
+++ b/preparation/Подготовка_к_защите.docx
@@ -26,7 +26,7 @@
     </w:p>
     <w:p>
       <w:r>
-        <w:t>«Программа обрабатывает изображения тремя способами. Сначала находит границы объектов: для этого используются Лаплас, Робертс и Собел. Потом убирает шум усредняющими фильтрами. Ещё есть порядковые фильтры: медиана, минимум и максимум.</w:t>
+        <w:t>«В программе выполнены два варианта: выделение контуров и удаление шума усредняющими фильтрами. Для контуров используются Лаплас, Робертс и Собел. Для удаления шума — обычное среднее и гауссов фильтр. По заданию двух вариантов достаточно для оценки 3.</w:t>
       </w:r>
     </w:p>
     <w:p>
@@ -36,7 +36,7 @@
     </w:p>
     <w:p>
       <w:r>
-        <w:t>Я сравниваю результаты на двух картинках: с крупными фигурами и с мелкими деталями. На крупных фигурах лучше сработала медиана 5×5, а на мелких деталях — медиана 3×3. Значит, большое окно не всегда лучше. В программе также есть тесты: прошли 18 тестов и 474 проверки».</w:t>
+        <w:t>Я сравниваю результаты на двух картинках: с крупными фигурами и с мелкими деталями. Из трёх проверенных усредняющих настроек меньшую ошибку дал гауссов фильтр 5×5. Но на мелких деталях размытие может навредить сильнее, чем помогает удаление шума. В программе есть тесты: прошли 18 тестов и 322 проверки».</w:t>
       </w:r>
     </w:p>
     <w:p>
@@ -109,7 +109,7 @@
         <w:jc w:val="left"/>
       </w:pPr>
       <w:r>
-        <w:t>6. Для удаления шума сравни mean3.png, mean5.png, gauss5.png, median3.png и median5.png. Потом покажи min3.png и max3.png.</w:t>
+        <w:t>6. Для удаления шума сравни mean3.png, mean5.png и gauss5.png.</w:t>
       </w:r>
     </w:p>
     <w:p>
@@ -535,7 +535,7 @@
     </w:tbl>
     <w:p>
       <w:r>
-        <w:t>В одном запуске программа получает одну картинку и сохраняет 11 файлов. Это вход в сером цвете и 10 результатов обработки. Четыре демонстрационных входа дают 44 выходных картинки. По умолчанию Visual Studio запускает обработку только одной шумной картинки с фигурами.</w:t>
+        <w:t>В одном запуске программа получает одну картинку и сохраняет 7 файлов. Это вход в сером цвете и 6 результатов обработки. Четыре демонстрационных входа дают 28 выходных картинок. По умолчанию Visual Studio запускает обработку только одной шумной картинки с фигурами.</w:t>
       </w:r>
     </w:p>
     <w:tbl>
@@ -861,96 +861,6 @@
                 <w:sz w:val="24"/>
               </w:rPr>
               <w:t>Гауссово усреднение, окно 5×5, σ=1</w:t>
-            </w:r>
-          </w:p>
-        </w:tc>
-      </w:tr>
-      <w:tr>
-        <w:trPr>
-          <w:cantSplit/>
-        </w:trPr>
-        <w:tc>
-          <w:tcPr>
-            <w:tcW w:type="dxa" w:w="4677"/>
-          </w:tcPr>
-          <w:p>
-            <w:pPr>
-              <w:keepNext w:val="0"/>
-              <w:spacing w:line="276" w:lineRule="auto"/>
-              <w:ind w:firstLine="0"/>
-              <w:jc w:val="left"/>
-            </w:pPr>
-            <w:r>
-              <w:rPr>
-                <w:b w:val="0"/>
-                <w:sz w:val="24"/>
-              </w:rPr>
-              <w:t>median3.png и median5.png</w:t>
-            </w:r>
-          </w:p>
-        </w:tc>
-        <w:tc>
-          <w:tcPr>
-            <w:tcW w:type="dxa" w:w="4677"/>
-          </w:tcPr>
-          <w:p>
-            <w:pPr>
-              <w:keepNext w:val="0"/>
-              <w:spacing w:line="276" w:lineRule="auto"/>
-              <w:ind w:firstLine="0"/>
-              <w:jc w:val="left"/>
-            </w:pPr>
-            <w:r>
-              <w:rPr>
-                <w:b w:val="0"/>
-                <w:sz w:val="24"/>
-              </w:rPr>
-              <w:t>Медианный фильтр с окном 3×3 и 5×5</w:t>
-            </w:r>
-          </w:p>
-        </w:tc>
-      </w:tr>
-      <w:tr>
-        <w:trPr>
-          <w:cantSplit/>
-        </w:trPr>
-        <w:tc>
-          <w:tcPr>
-            <w:tcW w:type="dxa" w:w="4677"/>
-          </w:tcPr>
-          <w:p>
-            <w:pPr>
-              <w:keepNext w:val="0"/>
-              <w:spacing w:line="276" w:lineRule="auto"/>
-              <w:ind w:firstLine="0"/>
-              <w:jc w:val="left"/>
-            </w:pPr>
-            <w:r>
-              <w:rPr>
-                <w:b w:val="0"/>
-                <w:sz w:val="24"/>
-              </w:rPr>
-              <w:t>min3.png и max3.png</w:t>
-            </w:r>
-          </w:p>
-        </w:tc>
-        <w:tc>
-          <w:tcPr>
-            <w:tcW w:type="dxa" w:w="4677"/>
-          </w:tcPr>
-          <w:p>
-            <w:pPr>
-              <w:keepNext w:val="0"/>
-              <w:spacing w:line="276" w:lineRule="auto"/>
-              <w:ind w:firstLine="0"/>
-              <w:jc w:val="left"/>
-            </w:pPr>
-            <w:r>
-              <w:rPr>
-                <w:b w:val="0"/>
-                <w:sz w:val="24"/>
-              </w:rPr>
-              <w:t>Минимум и максимум в окне 3×3</w:t>
             </w:r>
           </w:p>
         </w:tc>
@@ -1483,7 +1393,7 @@
     </w:p>
     <w:p>
       <w:r>
-        <w:t>В ImageMagick использовано -attenuate 0.9. Число 0.9 — настройка редактора, а не измеренное σ шума. Нельзя говорить, что картинки подготовлены в Photoshop: этого не было. В условии варианта 3 Photoshop назван отдельно — это отличие нужно согласовать с преподавателем.</w:t>
+        <w:t>В ImageMagick использовано -attenuate 0.9. Число 0.9 — настройка редактора, а не измеренное σ шума. Вариант 2 разрешает добавить шум в Photoshop или другом графическом редакторе, поэтому ImageMagick соответствует выбранному заданию.</w:t>
       </w:r>
     </w:p>
     <w:p>
@@ -1491,7 +1401,7 @@
         <w:pStyle w:val="Heading2"/>
       </w:pPr>
       <w:r>
-        <w:t>8. Медиана, минимум и максимум</w:t>
+        <w:t>8. Как объяснить результаты</w:t>
       </w:r>
     </w:p>
     <w:p>
@@ -1499,93 +1409,7 @@
         <w:pStyle w:val="Heading3"/>
       </w:pPr>
       <w:r>
-        <w:t>37. Что такое порядковый фильтр?</w:t>
-      </w:r>
-    </w:p>
-    <w:p>
-      <w:r>
-        <w:t>Он выбирает значение по его месту среди остальных чисел окна. Самое маленькое — минимум, самое большое — максимум, середина — медиана. Главное отличие от среднего: числа не складываются с весами, а выбирается одно из значений.</w:t>
-      </w:r>
-    </w:p>
-    <w:p>
-      <w:pPr>
-        <w:pStyle w:val="Heading3"/>
-      </w:pPr>
-      <w:r>
-        <w:t>38. Как работает медиана на простом примере?</w:t>
-      </w:r>
-    </w:p>
-    <w:p>
-      <w:r>
-        <w:t>Пусть в окне девять чисел: восемь раз 10 и один раз 255. После упорядочивания центральное, пятое число — 10. Значит, одиночный яркий выброс исчезнет. А среднее было бы примерно 37: выброс заметно повлиял бы на результат. Для окна 5×5 медиана — 13-е число из 25.</w:t>
-      </w:r>
-    </w:p>
-    <w:p>
-      <w:pPr>
-        <w:pStyle w:val="Heading3"/>
-      </w:pPr>
-      <w:r>
-        <w:t>39. Что делает nth_element?</w:t>
-      </w:r>
-    </w:p>
-    <w:p>
-      <w:r>
-        <w:t>Находит число, которое стояло бы на нужном месте после сортировки. Но полностью сортировать весь массив ей не обязательно. Нам нужна только середина, поэтому это удобнее полной сортировки. Для минимума и максимума используются min_element и max_element — они просто ищут крайнее значение.</w:t>
-      </w:r>
-    </w:p>
-    <w:p>
-      <w:pPr>
-        <w:pStyle w:val="Heading3"/>
-      </w:pPr>
-      <w:r>
-        <w:t>40. Почему медиана может убрать настоящую линию?</w:t>
-      </w:r>
-    </w:p>
-    <w:p>
-      <w:r>
-        <w:t>Если линия занимает меньше половины окна, большинство значений относится к фону. Тогда середина выборки тоже может оказаться фоном. Например, тонкая светлая линия в окне 5×5 легко исчезает. Поэтому медиана сохраняет границы лучше не во всех случаях и не при любом размере окна.</w:t>
-      </w:r>
-    </w:p>
-    <w:p>
-      <w:pPr>
-        <w:pStyle w:val="Heading3"/>
-      </w:pPr>
-      <w:r>
-        <w:t>41. Что делают минимум и максимум?</w:t>
-      </w:r>
-    </w:p>
-    <w:p>
-      <w:r>
-        <w:t>Минимум заменяет пиксель самым тёмным соседом: светлые объекты сужаются, картинка темнеет. Максимум выбирает самого светлого соседа: светлые объекты расширяются, картинка светлеет. Для нашего квадратного окна эти операции также называют эрозией и дилатацией. При гауссовом шуме они дают заметное смещение яркости.</w:t>
-      </w:r>
-    </w:p>
-    <w:p>
-      <w:pPr>
-        <w:pStyle w:val="Heading3"/>
-      </w:pPr>
-      <w:r>
-        <w:t>42. Медиана всегда лучше среднего?</w:t>
-      </w:r>
-    </w:p>
-    <w:p>
-      <w:r>
-        <w:t>Нет. Она особенно полезна против отдельных резких выбросов. При гауссовом шуме всё зависит от картинки и окна. У нас медиана показала хорошие результаты, но это вывод для двух конкретных сцен, а не доказательство для всех изображений.</w:t>
-      </w:r>
-    </w:p>
-    <w:p>
-      <w:pPr>
-        <w:pStyle w:val="Heading2"/>
-      </w:pPr>
-      <w:r>
-        <w:t>9. Как объяснить результаты</w:t>
-      </w:r>
-    </w:p>
-    <w:p>
-      <w:pPr>
-        <w:pStyle w:val="Heading3"/>
-      </w:pPr>
-      <w:r>
-        <w:t>43. Зачем две разные картинки?</w:t>
+        <w:t>37. Зачем две разные картинки?</w:t>
       </w:r>
     </w:p>
     <w:p>
@@ -1598,7 +1422,7 @@
         <w:pStyle w:val="Heading3"/>
       </w:pPr>
       <w:r>
-        <w:t>44. Что такое MSE простыми словами?</w:t>
+        <w:t>38. Что такое MSE простыми словами?</w:t>
       </w:r>
     </w:p>
     <w:p>
@@ -1611,7 +1435,7 @@
         <w:pStyle w:val="Heading3"/>
       </w:pPr>
       <w:r>
-        <w:t>45. Что такое PSNR?</w:t>
+        <w:t>39. Что такое PSNR?</w:t>
       </w:r>
     </w:p>
     <w:p>
@@ -1624,17 +1448,17 @@
         <w:pStyle w:val="Heading3"/>
       </w:pPr>
       <w:r>
-        <w:t>46. Какие результаты нужно помнить?</w:t>
+        <w:t>40. Какие результаты нужно помнить?</w:t>
       </w:r>
     </w:p>
     <w:p>
       <w:r>
-        <w:t>На крупных фигурах лучший из проверенных методов — медиана 5×5: MSE=44.62, PSNR=31.64 дБ. На мелких деталях — медиана 3×3: MSE=124.90, PSNR=27.17 дБ. Медиана 5×5 на мелких деталях дала MSE=830.54, потому что потеряла тонкие элементы. Это главный пример того, что размер окна нужно выбирать под изображение.</w:t>
+        <w:t>На крупных фигурах шумный вход имеет MSE=321.50. После обычного среднего 3×3 ошибка равна 111.66, после среднего 5×5 — 147.53, после Гаусса 5×5 — 95.38. Все три метода помогли, но увеличение обычного окна с 3 до 5 ухудшило результат из-за размытия границ.</w:t>
       </w:r>
     </w:p>
     <w:p>
       <w:r>
-        <w:t>Среди трёх усредняющих вариантов на обеих сценах меньше ошибся гауссов фильтр 5×5 с σ=1. Но на мелких деталях даже он оказался хуже шумного входа по общей MSE: потеря деталей перевесила пользу от сглаживания.</w:t>
+        <w:t>На мелких деталях шумный вход имеет MSE=321.63. После Гаусса 5×5 ошибка 400.27, а после обычного среднего 5×5 — 873.40. Шум стал слабее, но часть тонких линий исчезла. Из наших усредняющих настроек на обеих сценах меньше ошибся Гаусс 5×5 с σ=1, однако даже он не гарантирует улучшения любого изображения.</w:t>
       </w:r>
     </w:p>
     <w:p>
@@ -1642,7 +1466,7 @@
         <w:pStyle w:val="Heading3"/>
       </w:pPr>
       <w:r>
-        <w:t>47. Почему шум слабее, а ошибка иногда больше?</w:t>
+        <w:t>41. Почему шум слабее, а ошибка иногда больше?</w:t>
       </w:r>
     </w:p>
     <w:p>
@@ -1655,7 +1479,7 @@
         <w:pStyle w:val="Heading3"/>
       </w:pPr>
       <w:r>
-        <w:t>48. Где программа считает MSE и PSNR?</w:t>
+        <w:t>42. Где программа считает MSE и PSNR?</w:t>
       </w:r>
     </w:p>
     <w:p>
@@ -1668,7 +1492,7 @@
         <w:pStyle w:val="Heading2"/>
       </w:pPr>
       <w:r>
-        <w:t>10. Ошибки и тесты</w:t>
+        <w:t>9. Ошибки и тесты</w:t>
       </w:r>
     </w:p>
     <w:p>
@@ -1676,7 +1500,7 @@
         <w:pStyle w:val="Heading3"/>
       </w:pPr>
       <w:r>
-        <w:t>49. Что такое исключение, try и catch?</w:t>
+        <w:t>43. Что такое исключение, try и catch?</w:t>
       </w:r>
     </w:p>
     <w:p>
@@ -1689,7 +1513,7 @@
         <w:pStyle w:val="Heading3"/>
       </w:pPr>
       <w:r>
-        <w:t>50. Что происходит, если входной файл не найден?</w:t>
+        <w:t>44. Что происходит, если входной файл не найден?</w:t>
       </w:r>
     </w:p>
     <w:p>
@@ -1702,7 +1526,7 @@
         <w:pStyle w:val="Heading3"/>
       </w:pPr>
       <w:r>
-        <w:t>51. Что происходит, если результат не записывается?</w:t>
+        <w:t>45. Что происходит, если результат не записывается?</w:t>
       </w:r>
     </w:p>
     <w:p>
@@ -1715,7 +1539,7 @@
         <w:pStyle w:val="Heading3"/>
       </w:pPr>
       <w:r>
-        <w:t>52. Что значит код завершения 1?</w:t>
+        <w:t>46. Что значит код завершения 1?</w:t>
       </w:r>
     </w:p>
     <w:p>
@@ -1728,7 +1552,7 @@
         <w:pStyle w:val="Heading3"/>
       </w:pPr>
       <w:r>
-        <w:t>53. Что ещё проверяет программа?</w:t>
+        <w:t>47. Что ещё проверяет программа?</w:t>
       </w:r>
     </w:p>
     <w:p>
@@ -1741,12 +1565,12 @@
         <w:pStyle w:val="Heading3"/>
       </w:pPr>
       <w:r>
-        <w:t>54. Зачем тесты и что значат 18 и 474?</w:t>
+        <w:t>48. Зачем тесты и что значат 18 и 322?</w:t>
       </w:r>
     </w:p>
     <w:p>
       <w:r>
-        <w:t>18 — количество тестовых случаев. 474 — отдельных проверяемых условий внутри них. Есть 12 случаев из задания и 6 дополнительных. Проверяются загрузка и запись, каналы, копирование, безопасность и ручные расчёты фильтров. Все тесты прошли, но это не означает, что программа проверена на абсолютно всех возможных входах.</w:t>
+        <w:t>18 — количество тестовых случаев. 322 — отдельных проверяемых условий внутри них. Есть 12 случаев из задания и 6 дополнительных. Проверяются загрузка и запись, каналы, копирование, безопасность и ручные расчёты фильтров. Все тесты прошли, но это не означает, что программа проверена на абсолютно всех возможных входах.</w:t>
       </w:r>
     </w:p>
     <w:p>
@@ -1754,7 +1578,7 @@
         <w:pStyle w:val="Heading3"/>
       </w:pPr>
       <w:r>
-        <w:t>55. Какие тесты нужно уметь объяснить?</w:t>
+        <w:t>49. Какие тесты нужно уметь объяснить?</w:t>
       </w:r>
     </w:p>
     <w:p>
@@ -1767,7 +1591,7 @@
         <w:pStyle w:val="Heading2"/>
       </w:pPr>
       <w:r>
-        <w:t>11. Пять расчётов, которые стоит понять</w:t>
+        <w:t>10. Пять расчётов, которые стоит понять</w:t>
       </w:r>
     </w:p>
     <w:p>
@@ -1780,7 +1604,7 @@
     </w:p>
     <w:p>
       <w:r>
-        <w:t>Все пиксели равны 90. У Лапласа: 90+90+90+90−4×90=0. У Робертса разности 90−90 тоже равны нулю. У Собела отрицательные и положительные части маски взаимно погашаются. Обычное среднее, Гаусс, медиана, минимум и максимум дают 90.</w:t>
+        <w:t>Все пиксели равны 90. У Лапласа: 90+90+90+90−4×90=0. У Робертса разности 90−90 тоже равны нулю. У Собела отрицательные и положительные части маски взаимно погашаются. Обычное среднее и Гаусс дают 90.</w:t>
       </w:r>
     </w:p>
     <w:p>
@@ -1806,7 +1630,7 @@
     </w:p>
     <w:p>
       <w:r>
-        <w:t>В окне 3×3 одна яркость 255 и восемь нулей. Обычное среднее: 255/9≈28.33 → 28. Медиана — 0, минимум — 0, максимум — 255. Гауссов фильтр 3×3 при σ=1 даёт около 52, потому что центр весит больше соседей. Такой гауссов расчёт есть в тесте; в основном запуске используется окно 5×5.</w:t>
+        <w:t>В окне 3×3 одна яркость 255 и восемь нулей. Обычное среднее: 255/9≈28.33 → 28. Гауссов фильтр 3×3 при σ=1 даёт около 52, потому что центр весит больше соседей. Такой гауссов расчёт есть в тесте; в основном запуске используется окно 5×5.</w:t>
       </w:r>
     </w:p>
     <w:p>
@@ -1840,7 +1664,7 @@
         <w:pStyle w:val="Heading2"/>
       </w:pPr>
       <w:r>
-        <w:t>12. Если преподаватель спросит глубже</w:t>
+        <w:t>11. Если преподаватель спросит глубже</w:t>
       </w:r>
     </w:p>
     <w:p>
@@ -1848,7 +1672,7 @@
         <w:pStyle w:val="Heading3"/>
       </w:pPr>
       <w:r>
-        <w:t>56. Почему нельзя записывать результат прямо в исходную картинку?</w:t>
+        <w:t>50. Почему нельзя записывать результат прямо в исходную картинку?</w:t>
       </w:r>
     </w:p>
     <w:p>
@@ -1861,7 +1685,7 @@
         <w:pStyle w:val="Heading3"/>
       </w:pPr>
       <w:r>
-        <w:t>57. Зачем в isRead ещё один умный указатель с функцией удаления?</w:t>
+        <w:t>51. Зачем в isRead ещё один умный указатель с функцией удаления?</w:t>
       </w:r>
     </w:p>
     <w:p>
@@ -1874,12 +1698,12 @@
         <w:pStyle w:val="Heading3"/>
       </w:pPr>
       <w:r>
-        <w:t>58. Почему библиотека stb есть, но фильтры считаются «нашими»?</w:t>
+        <w:t>52. Почему библиотека stb есть, но фильтры считаются «нашими»?</w:t>
       </w:r>
     </w:p>
     <w:p>
       <w:r>
-        <w:t>stb читает и записывает формат файла. Она не вычисляет вместо нас Собела, медиану или усреднение. Их формулы, обход соседей и запись результатов реализованы в Processing.cpp. Готовый внешний алгоритм фильтрации не вызывается.</w:t>
+        <w:t>stb читает и записывает формат файла. Она не вычисляет вместо нас Собела или усреднение. Их формулы, обход соседей и запись результатов реализованы в Processing.cpp. Готовый внешний алгоритм фильтрации не вызывается.</w:t>
       </w:r>
     </w:p>
     <w:p>
@@ -1887,7 +1711,7 @@
         <w:pStyle w:val="Heading3"/>
       </w:pPr>
       <w:r>
-        <w:t>59. Что значит namespace, enum class, auto и лямбда?</w:t>
+        <w:t>53. Что значит namespace, enum class, auto и лямбда?</w:t>
       </w:r>
     </w:p>
     <w:p>
@@ -1900,7 +1724,7 @@
         <w:pStyle w:val="Heading3"/>
       </w:pPr>
       <w:r>
-        <w:t>60. Зачем STB_IMAGE_IMPLEMENTATION и почему их нельзя писать везде?</w:t>
+        <w:t>54. Зачем STB_IMAGE_IMPLEMENTATION и почему их нельзя писать везде?</w:t>
       </w:r>
     </w:p>
     <w:p>
@@ -1918,12 +1742,12 @@
         <w:pStyle w:val="Heading3"/>
       </w:pPr>
       <w:r>
-        <w:t>61. Что такое линейный и нелинейный фильтр?</w:t>
+        <w:t>55. Что такое линейный и нелинейный фильтр?</w:t>
       </w:r>
     </w:p>
     <w:p>
       <w:r>
-        <w:t>Усреднение до округления — взвешенная сумма пикселей: такой расчёт линейный. Медиана, минимум и максимум выбирают значения по сравнению, а не по постоянной взвешенной сумме: они нелинейны. Важная тонкость: даже у линейного ядра окончательная запись с округлением, модулем или обрезанием диапазона уже добавляет нелинейное действие.</w:t>
+        <w:t>Линейный расчёт — это сумма пикселей с постоянными коэффициентами. Так устроено усреднение до округления. Но взятие модуля, округление и обрезание результата 0–255 уже не являются линейными действиями. Поэтому весь итоговый конвейер не нужно без оговорок называть строго линейным.</w:t>
       </w:r>
     </w:p>
     <w:p>
@@ -1931,7 +1755,7 @@
         <w:pStyle w:val="Heading3"/>
       </w:pPr>
       <w:r>
-        <w:t>62. А у нас точно математическая свёртка?</w:t>
+        <w:t>56. А у нас точно математическая свёртка?</w:t>
       </w:r>
     </w:p>
     <w:p>
@@ -1944,7 +1768,7 @@
         <w:pStyle w:val="Heading3"/>
       </w:pPr>
       <w:r>
-        <w:t>63. Как быстро работает программа и как её можно ускорить?</w:t>
+        <w:t>57. Как быстро работает программа и как её можно ускорить?</w:t>
       </w:r>
     </w:p>
     <w:p>
@@ -1957,7 +1781,7 @@
         <w:pStyle w:val="Heading3"/>
       </w:pPr>
       <w:r>
-        <w:t>64. Что программа пока не умеет?</w:t>
+        <w:t>58. Что программа пока не умеет?</w:t>
       </w:r>
     </w:p>
     <w:p>
@@ -1975,7 +1799,7 @@
         <w:pStyle w:val="Heading2"/>
       </w:pPr>
       <w:r>
-        <w:t>13. Короткие ответы, которые удобно запомнить</w:t>
+        <w:t>12. Короткие ответы, которые удобно запомнить</w:t>
       </w:r>
     </w:p>
     <w:p>
@@ -2005,12 +1829,7 @@
     </w:p>
     <w:p>
       <w:r>
-        <w:t>«Почему медиана убрала линию?» — Линия заняла меньшую часть окна, и медиана выбрала фон.</w:t>
-      </w:r>
-    </w:p>
-    <w:p>
-      <w:r>
-        <w:t>«Какой метод лучше?» — Для крупных фигур здесь медиана 5×5, для мелких деталей — 3×3. Универсального победителя нет.</w:t>
+        <w:t>«Какой фильтр лучше?» — Из трёх проверенных усреднений меньше ошибся Гаусс 5×5 с σ=1. Но размер окна и полезность сглаживания зависят от изображения.</w:t>
       </w:r>
     </w:p>
     <w:p>

</xml_diff>

<commit_message>
Align lab layout and Filters API with reference for variants 1 and 2
</commit_message>
<xml_diff>
--- a/preparation/Подготовка_к_защите.docx
+++ b/preparation/Подготовка_к_защите.docx
@@ -36,7 +36,7 @@
     </w:p>
     <w:p>
       <w:r>
-        <w:t>Я сравниваю результаты на двух картинках: с крупными фигурами и с мелкими деталями. Из трёх проверенных усредняющих настроек меньшую ошибку дал гауссов фильтр 5×5. Но на мелких деталях размытие может навредить сильнее, чем помогает удаление шума. В программе есть тесты: прошли 18 тестов и 322 проверки».</w:t>
+        <w:t>Я сравниваю результаты на двух картинках: с крупными фигурами и с мелкими деталями. Из трёх проверенных усредняющих настроек меньшую ошибку дал гауссов фильтр 5×5. Но на мелких деталях размытие может навредить сильнее, чем помогает удаление шума. В программе есть тесты: прошли 18 тестов и 323 проверки».</w:t>
       </w:r>
     </w:p>
     <w:p>
@@ -79,7 +79,7 @@
         <w:jc w:val="left"/>
       </w:pPr>
       <w:r>
-        <w:t>3. Программа обработает input/shapes_noisy.png. Результаты окажутся в output/shapes_noisy. Картинки нужно открыть самостоятельно: программа не показывает их отдельным окном.</w:t>
+        <w:t>3. Программа обработает test_input/shapes_noisy.png. Результаты окажутся в test_output/shapes_noisy. Картинки нужно открыть самостоятельно: программа не показывает их отдельным окном.</w:t>
       </w:r>
     </w:p>
     <w:p>
@@ -89,7 +89,7 @@
         <w:jc w:val="left"/>
       </w:pPr>
       <w:r>
-        <w:t>4. Сначала покажи чистую картинку input/shapes.png и её шумную версию input/shapes_noisy.png. Затем результаты фильтров.</w:t>
+        <w:t>4. Сначала покажи чистую картинку test_input/shapes.png и её шумную версию test_input/shapes_noisy.png. Затем результаты фильтров.</w:t>
       </w:r>
     </w:p>
     <w:p>
@@ -99,7 +99,7 @@
         <w:jc w:val="left"/>
       </w:pPr>
       <w:r>
-        <w:t>5. Для контуров сравни laplace.png, roberts.png и sobel.png. Чистые контуры находятся в output/shapes, контуры с шумом — в output/shapes_noisy.</w:t>
+        <w:t>5. Для контуров сравни laplace.png, roberts.png и sobel.png. Чистые контуры находятся в test_output/shapes, контуры с шумом — в test_output/shapes_noisy.</w:t>
       </w:r>
     </w:p>
     <w:p>
@@ -119,7 +119,7 @@
         <w:jc w:val="left"/>
       </w:pPr>
       <w:r>
-        <w:t>7. Покажи такие же результаты из output/detail_noisy. На этой картинке лучше видна потеря тонких линий.</w:t>
+        <w:t>7. Покажи такие же результаты из test_output/detail_noisy. На этой картинке лучше видна потеря тонких линий.</w:t>
       </w:r>
     </w:p>
     <w:p>
@@ -139,12 +139,12 @@
         <w:jc w:val="left"/>
       </w:pPr>
       <w:r>
-        <w:t>9. Открой отчёт с формулами и результатами. Будь готов открыть Image.cpp и Processing.cpp.</w:t>
+        <w:t>9. Открой отчёт с формулами и результатами. Будь готов открыть Image.cpp и Filters.cpp.</w:t>
       </w:r>
     </w:p>
     <w:p>
       <w:r>
-        <w:t>Для нового входного файла: свойства проекта Lab → «Отладка» → «Аргументы команды». Например: input/detail_noisy.png output/detail_noisy. Первый путь — откуда брать картинку, второй — куда сохранять результат. Рабочий каталог уже настроен на папку с Lab.sln.</w:t>
+        <w:t>Для нового входного файла: свойства проекта Lab → «Отладка» → «Аргументы команды». Например: test_input/detail_noisy.png test_output/detail_noisy. Первый путь — откуда брать картинку, второй — куда сохранять результат. Рабочий каталог уже настроен на папку с Lab.sln.</w:t>
       </w:r>
     </w:p>
     <w:p>
@@ -327,7 +327,7 @@
                 <w:b w:val="0"/>
                 <w:sz w:val="24"/>
               </w:rPr>
-              <w:t>Processing.h</w:t>
+              <w:t>Filters.h</w:t>
             </w:r>
           </w:p>
         </w:tc>
@@ -347,7 +347,7 @@
                 <w:b w:val="0"/>
                 <w:sz w:val="24"/>
               </w:rPr>
-              <w:t>Объявления фильтров и названия вариантов обработки</w:t>
+              <w:t>Объявления toGrayscale, applySobel, applyRoberts, applyLaplacian, applyBoxBlur, applyGaussianBlur</w:t>
             </w:r>
           </w:p>
         </w:tc>
@@ -372,7 +372,7 @@
                 <w:b w:val="0"/>
                 <w:sz w:val="24"/>
               </w:rPr>
-              <w:t>Processing.cpp</w:t>
+              <w:t>Filters.cpp</w:t>
             </w:r>
           </w:p>
         </w:tc>
@@ -417,7 +417,7 @@
                 <w:b w:val="0"/>
                 <w:sz w:val="24"/>
               </w:rPr>
-              <w:t>main.cpp</w:t>
+              <w:t>Source.cpp</w:t>
             </w:r>
           </w:p>
         </w:tc>
@@ -507,7 +507,7 @@
                 <w:b w:val="0"/>
                 <w:sz w:val="24"/>
               </w:rPr>
-              <w:t>tests_processing.cpp</w:t>
+              <w:t>tests_filters.cpp</w:t>
             </w:r>
           </w:p>
         </w:tc>
@@ -533,6 +533,11 @@
         </w:tc>
       </w:tr>
     </w:tbl>
+    <w:p>
+      <w:r>
+        <w:t>Source.cpp запускает функции Filters. Их названия соответствуют методам: applySobel — Собел, applyRoberts — Робертс, applyLaplacian — Лаплас, applyBoxBlur — обычное среднее, applyGaussianBlur — Гаусс. Сначала toGrayscale получает серый вход.</w:t>
+      </w:r>
+    </w:p>
     <w:p>
       <w:r>
         <w:t>В одном запуске программа получает одну картинку и сохраняет 7 файлов. Это вход в сером цвете и 6 результатов обработки. Четыре демонстрационных входа дают 28 выходных картинок. По умолчанию Visual Studio запускает обработку только одной шумной картинки с фигурами.</w:t>
@@ -1349,7 +1354,7 @@
     </w:p>
     <w:p>
       <w:r>
-        <w:t>Параметр, который определяет, насколько сильно учитываются дальние соседи. При небольшом σ основное влияние у центра. При большом веса в том же окне становятся более похожими друг на друга. В нашем основном запуске окно 5×5 и σ=1. Если в average передать σ=0, код специально выбирает обычное среднее — ноль не подставляется в гауссову формулу.</w:t>
+        <w:t>Параметр, который определяет, насколько сильно учитываются дальние соседи. При небольшом σ основное влияние у центра. При большом веса в том же окне становятся более похожими друг на друга. В нашем основном запуске окно 5×5 и σ=1. Для обычного среднего вызывается applyBoxBlur. Для Гаусса — applyGaussianBlur с положительным σ. Эти функции используют общий внутренний расчёт average; он не вызывается напрямую из Source.cpp.</w:t>
       </w:r>
     </w:p>
     <w:p>
@@ -1484,7 +1489,7 @@
     </w:p>
     <w:p>
       <w:r>
-        <w:t>Не в main.cpp. Эти числа считает Python-скрипт make_report.py из сохранённых картинок. Они записаны в reports/metrics.json и отчёт. C++-часть выполняет фильтрацию и сохраняет PNG. Контурные карты не сравниваются с исходной картинкой по MSE: для них нужна отдельная разметка правильных границ, которой здесь нет.</w:t>
+        <w:t>Не в Source.cpp. Эти числа считает Python-скрипт make_report.py из сохранённых картинок. Они записаны в reports/metrics.json и отчёт. C++-часть выполняет фильтрацию и сохраняет PNG. Контурные карты не сравниваются с исходной картинкой по MSE: для них нужна отдельная разметка правильных границ, которой здесь нет.</w:t>
       </w:r>
     </w:p>
     <w:p>
@@ -1544,7 +1549,7 @@
     </w:p>
     <w:p>
       <w:r>
-        <w:t>Это сигнал операционной системе: запуск закончился неудачно. Ноль означает успех. Конкретная причина показывается в сообщении, а не в разных кодах для каждой ошибки. Если нет двух аргументов запуска, программа печатает Usage и также возвращает 1.</w:t>
+        <w:t>Это сигнал операционной системе: запуск закончился неудачно. Ноль означает успех. Конкретная причина показывается в сообщении, а не в разных кодах для каждой ошибки. Без аргументов запуска программа берёт готовую картинку test_input/shapes_noisy.png и сохраняет результат в test_output/shapes_noisy. Можно указать два аргумента, чтобы выбрать другие пути. Если передать неправильное количество аргументов, появится Usage и код 1.</w:t>
       </w:r>
     </w:p>
     <w:p>
@@ -1557,7 +1562,7 @@
     </w:p>
     <w:p>
       <w:r>
-        <w:t>Размеры и число каналов изображения. Непустой серый вход для фильтров. Нечётный размер окна от 1 до 31. Отсутствие отрицательного и нечислового σ. Отдельно есть проверки доступа к пикселям и результата сохранения. Если создание выходной папки выдаст стандартное исключение, main тоже его перехватит.</w:t>
+        <w:t>Размеры и число каналов изображения. Непустой серый вход для фильтров. Нечётный размер окна от 1 до 31. Положительное конечное σ для гауссова фильтра. Отдельно есть проверки доступа к пикселям и результата сохранения. Если создание выходной папки выдаст стандартное исключение, main тоже его перехватит.</w:t>
       </w:r>
     </w:p>
     <w:p>
@@ -1565,12 +1570,12 @@
         <w:pStyle w:val="Heading3"/>
       </w:pPr>
       <w:r>
-        <w:t>48. Зачем тесты и что значат 18 и 322?</w:t>
+        <w:t>48. Зачем тесты и что значат 18 и 323?</w:t>
       </w:r>
     </w:p>
     <w:p>
       <w:r>
-        <w:t>18 — количество тестовых случаев. 322 — отдельных проверяемых условий внутри них. Есть 12 случаев из задания и 6 дополнительных. Проверяются загрузка и запись, каналы, копирование, безопасность и ручные расчёты фильтров. Все тесты прошли, но это не означает, что программа проверена на абсолютно всех возможных входах.</w:t>
+        <w:t>18 — количество тестовых случаев. 323 — отдельных проверяемых условий внутри них. Есть 12 случаев из задания и 6 дополнительных. Проверяются загрузка и запись, каналы, копирование, безопасность и ручные расчёты фильтров. Все тесты прошли, но это не означает, что программа проверена на абсолютно всех возможных входах.</w:t>
       </w:r>
     </w:p>
     <w:p>
@@ -1703,7 +1708,7 @@
     </w:p>
     <w:p>
       <w:r>
-        <w:t>stb читает и записывает формат файла. Она не вычисляет вместо нас Собела или усреднение. Их формулы, обход соседей и запись результатов реализованы в Processing.cpp. Готовый внешний алгоритм фильтрации не вызывается.</w:t>
+        <w:t>stb читает и записывает формат файла. Она не вычисляет вместо нас Собела или усреднение. Их формулы, обход соседей и запись результатов реализованы в Filters.cpp. Готовый внешний алгоритм фильтрации не вызывается.</w:t>
       </w:r>
     </w:p>
     <w:p>
@@ -1716,7 +1721,7 @@
     </w:p>
     <w:p>
       <w:r>
-        <w:t>namespace processing — общая «папка имён» для наших функций, чтобы их проще было отличать от других. enum class — набор понятных вариантов выбора, например Edge::Sobel вместо числа 3. auto просит компилятор определить тип из выражения справа. Лямбда save — небольшая локальная функция, чтобы не повторять один и тот же код сохранения и проверки ошибки.</w:t>
+        <w:t>namespace Filters — общая «папка имён» для наших функций. Например, Filters::applySobel означает «функция Собела из группы Filters». enum class Edge используется внутри Filters.cpp, чтобы общий внутренний расчёт различал три оператора; из Source.cpp вызываются отдельные функции applySobel, applyRoberts и applyLaplacian. auto просит компилятор определить тип из выражения справа. Лямбда save — небольшая локальная функция, чтобы не повторять один и тот же код сохранения и проверки ошибки.</w:t>
       </w:r>
     </w:p>
     <w:p>
@@ -1809,7 +1814,7 @@
     </w:p>
     <w:p>
       <w:r>
-        <w:t>«Почему отдельный Processing.cpp?» — По условию нельзя расширять интерфейс Image.</w:t>
+        <w:t>«Почему отдельный Filters.cpp?» — По условию нельзя расширять интерфейс Image.</w:t>
       </w:r>
     </w:p>
     <w:p>

</xml_diff>

<commit_message>
Add original random test generator and friendly console workflow
</commit_message>
<xml_diff>
--- a/preparation/Подготовка_к_защите.docx
+++ b/preparation/Подготовка_к_защите.docx
@@ -1393,7 +1393,7 @@
     </w:p>
     <w:p>
       <w:r>
-        <w:t>Шум подготовлен заранее через редактор ImageMagick, который вызывает prepare_images.py. C++-программа его не добавляет, а читает готовый шумный PNG. Измеренное стандартное отклонение шума около 17.92 уровней яркости. Это не то же самое, что σ=1 у фильтра: там параметр относится к расстоянию между пикселями.</w:t>
+        <w:t>Шум подготовлен заранее через редактор ImageMagick, который вызывает prepare_images.py. В основном опыте C++-программа читает готовый шумный PNG из редактора. Дополнительный режим --random сам создаёт шум для быстрой проверки; это отдельный тест, не источник таблиц отчёта. Измеренное стандартное отклонение шума около 17.92 уровней яркости. Это не то же самое, что σ=1 у фильтра: там параметр относится к расстоянию между пикселями.</w:t>
       </w:r>
     </w:p>
     <w:p>
@@ -1536,7 +1536,7 @@
     </w:p>
     <w:p>
       <w:r>
-        <w:t>isWrite возвращает false. Лямбда save в main превращает его в ошибку Cannot save. main перехватывает её и завершает запуск. Нужно проверить доступность папки и право записи. Если несколько файлов уже сохранены, они останутся: программа не откатывает всё назад и не удаляет их.</w:t>
+        <w:t>isWrite возвращает false. Функция saveImage превращает его в ошибку Cannot save. В runFilters лямбда save вызывает эту функцию для каждого результата. main перехватывает ошибку и завершает запуск. Нужно проверить доступность папки и право записи. Если несколько файлов уже сохранены, они останутся: программа не откатывает всё назад и не удаляет их.</w:t>
       </w:r>
     </w:p>
     <w:p>
@@ -1549,7 +1549,7 @@
     </w:p>
     <w:p>
       <w:r>
-        <w:t>Это сигнал операционной системе: запуск закончился неудачно. Ноль означает успех. Конкретная причина показывается в сообщении, а не в разных кодах для каждой ошибки. Без аргументов запуска программа берёт готовую картинку test_input/shapes_noisy.png и сохраняет результат в test_output/shapes_noisy. Можно указать два аргумента, чтобы выбрать другие пути. Если передать неправильное количество аргументов, появится Usage и код 1.</w:t>
+        <w:t>Это сигнал операционной системе: запуск закончился неудачно. Ноль означает успех. Конкретная причина показывается в сообщении, а не в разных кодах для каждой ошибки. Без аргументов запуска программа берёт готовую картинку test_input/shapes_noisy.png и сохраняет результат в test_output/shapes_noisy. Можно указать два аргумента, чтобы выбрать другие пути. Если передать неправильное количество аргументов, появится справка и код 1. Флаг --random запускает дополнительный случайный тест, --help показывает справку. Если готового входа нет, запуск без аргументов создаст случайный тест автоматически.</w:t>
       </w:r>
     </w:p>
     <w:p>
@@ -1791,12 +1791,45 @@
     </w:p>
     <w:p>
       <w:r>
-        <w:t>У неё нет графического интерфейса и автоматического показа PNG. Параметры фильтров задаются вызовами в main, а не меню. Прозрачность не накладывается на фон при переводе в серый. Уже записанные файлы не удаляются после последующей ошибки. Все результаты нужно оценивать для выбранных входов, а не объявлять один фильтр лучшим навсегда.</w:t>
+        <w:t>У неё нет графического интерфейса и автоматического показа PNG. Параметры фильтров задаются вызовами в runFilters внутри Source.cpp, а не меню. Прозрачность не накладывается на фон при переводе в серый. Уже записанные файлы не удаляются после последующей ошибки. Все результаты нужно оценивать для выбранных входов, а не объявлять один фильтр лучшим навсегда.</w:t>
       </w:r>
     </w:p>
     <w:p>
       <w:r>
         <w:t>Ещё две тонкости: сам setColor не обрезает неправильный цвет — он переводит его в байт; за допустимый диапазон результатов фильтра отвечает put. И проверка σ не защищает от всех крайних значений компьютерной арифметики: очень маленькое положительное σ может вызвать проблемы в вычислении σ². Для работы и тестов используются обычные значения, в основном σ=1.</w:t>
+      </w:r>
+    </w:p>
+    <w:p>
+      <w:pPr>
+        <w:pStyle w:val="Heading3"/>
+      </w:pPr>
+      <w:r>
+        <w:t>59. Зачем random в Source.cpp и как его объяснить?</w:t>
+      </w:r>
+    </w:p>
+    <w:p>
+      <w:r>
+        <w:t>Это дополнительная тестовая картинка, которую можно получить без поиска файла вручную. Команда --random 73 создаёт градиентный фон, шесть прямоугольников со случайными положениями, размерами и яркостями, а также тонкие штрихи. Размер картинки — 320×224. Затем к копии добавляется гауссов шум со стандартным отклонением 18 и запускаются наши фильтры вариантов 1 и 2.</w:t>
+      </w:r>
+    </w:p>
+    <w:p>
+      <w:r>
+        <w:t>std::mt19937 — генератор последовательности случайных чисел. seed — начальное число: оно задаёт, с какой последовательности начать. uniform_int_distribution выбирает целые числа для прямоугольников; normal_distribution — шум, где небольшие отклонения встречаются чаще больших. После добавления шума яркость ограничивается 0–255.</w:t>
+      </w:r>
+    </w:p>
+    <w:p>
+      <w:r>
+        <w:t>Одинаковый seed в одной сборке даёт тот же тест, поэтому ошибку можно повторить. С другим seed картинка меняется. Стандартная библиотека может реализовать распределения по-разному, поэтому не стоит обещать побайтовое совпадение между разными компиляторами.</w:t>
+      </w:r>
+    </w:p>
+    <w:p>
+      <w:r>
+        <w:t>Чистая картинка и шумная копия лежат в test_input/generated/&lt;seed&gt;, результаты — в test_output/random_&lt;seed&gt;. В генераторе используется глубокое копирование Image noisy(clean): шум меняет только копию. По умолчанию seed=2026. Если готовая картинка для обычного запуска пропала, программа тоже создаст этот дополнительный тест.</w:t>
+      </w:r>
+    </w:p>
+    <w:p>
+      <w:r>
+        <w:t>Важно для условия: изображения с шумом для основного отчёта подготовлены редактором ImageMagick. Генератор в C++ — дополнительная проверка и не подменяет это требование. Третьего варианта он не добавляет. В Windows SetConsoleOutputCP(CP_UTF8) настраивает вывод русских сообщений в консоли; фильтрацию эта настройка не меняет.</w:t>
       </w:r>
     </w:p>
     <w:p>

</xml_diff>